<commit_message>
Burn 100% of sales from Available Credits and hide Sale Margin.
The 2% processing-fee haircut is gone, so a ₱1,000 sale now debits ₱1,000 of inventory.

Co-authored-by: Cursor <cursoragent@cursor.com>
</commit_message>
<xml_diff>
--- a/docs/module-checklist-by-role.docx
+++ b/docs/module-checklist-by-role.docx
@@ -9240,7 +9240,7 @@
           <w:color w:val="0F172A"/>
           <w:sz w:val="22"/>
         </w:rPr>
-        <w:t>Initial UI/UX — Available Credits, sale margin, request CTA</w:t>
+        <w:t>Initial UI/UX — Available Credits, request CTA</w:t>
       </w:r>
       <w:r>
         <w:rPr>
@@ -9760,7 +9760,7 @@
           <w:color w:val="0F172A"/>
           <w:sz w:val="22"/>
         </w:rPr>
-        <w:t>Frontend implementation — Burns ~97% credits; stamps commission % of sales</w:t>
+        <w:t>Frontend implementation — Burns 100% credits; stamps commission % of sales</w:t>
       </w:r>
       <w:r>
         <w:rPr>

</xml_diff>